<commit_message>
Flowchart: sửa theo code hiện tại; idea.docx: train không oversample nhóm B
- Luồng hệ thống: truy xuất chọn ngẫu nhiên 1 món trong đích trọng số cao nhất, ánh xạ chung *:*
  khi không state nào khớp; chặn gợi ý món dùng chung lượt sinh lại (nutrition_blocked).
- Luồng dữ liệu: không oversample (OVERSAMPLE = 1), số mẫu train từng nhóm; 8 người chấm;
  "P và 3 baseline".

Co-Authored-By: Claude Opus 5.5 (1M context) <noreply@anthropic.com>
</commit_message>
<xml_diff>
--- a/idea.docx
+++ b/idea.docx
@@ -4569,10 +4569,10 @@
         <w:rPr>
           <w:b/>
         </w:rPr>
-        <w:t xml:space="preserve">oversample B ×3</w:t>
-      </w:r>
-      <w:r>
-        <w:t xml:space="preserve">), xáo trộn với seed cố định. Validation không oversample; test không dùng khi train.</w:t>
+        <w:t>không oversample</w:t>
+      </w:r>
+      <w:r>
+        <w:t>), xáo trộn với seed cố định (OVERSAMPLE = 1 cho mọi nhóm trong notebook fine-tune). Validation không oversample; test không dùng khi train.</w:t>
       </w:r>
     </w:p>
     <w:tbl>
@@ -4717,18 +4717,18 @@
           <w:p>
             <w:pPr/>
             <w:r>
-              <w:t xml:space="preserve">phần còn lại (~4.320)</w:t>
-            </w:r>
-          </w:p>
-        </w:tc>
-        <w:tc>
-          <w:tcPr>
-            <w:tcW w:w="3120" w:type="dxa"/>
-          </w:tcPr>
-          <w:p>
-            <w:pPr/>
-            <w:r>
-              <w:t xml:space="preserve">phần còn lại (~864, ×3 khi trộn ≈ 2.592)</w:t>
+              <w:t>phần còn lại (3.447)</w:t>
+            </w:r>
+          </w:p>
+        </w:tc>
+        <w:tc>
+          <w:tcPr>
+            <w:tcW w:w="3120" w:type="dxa"/>
+          </w:tcPr>
+          <w:p>
+            <w:pPr/>
+            <w:r>
+              <w:t>phần còn lại (B1 859, B2 813, B3 864, B4 864; không oversample)</w:t>
             </w:r>
           </w:p>
         </w:tc>
@@ -5239,7 +5239,7 @@
         <w:t xml:space="preserve">B1_train.jsonl</w:t>
       </w:r>
       <w:r>
-        <w:t xml:space="preserve">…) để oversample và đánh giá riêng từng nhóm; script huấn luyện gộp lại trước khi train.</w:t>
+        <w:t>…) để đánh giá riêng từng nhóm; script huấn luyện gộp lại trước khi train.</w:t>
       </w:r>
     </w:p>
     <w:p>

</xml_diff>

<commit_message>
Loại NUT_043 (Tiết lợn sống) và NUT_113 (Lá sắn tươi) khỏi gợi ý theo góp ý chuyên gia
- state_effect_map.json: excluded_foods = NUT_060, NUT_043, NUT_113; _note ghi lý do từng mã.
- Không đổi số liệu đã báo cáo: bộ crisis và safety không vào nhánh gợi ý món; đích tác động và trọng số
  giống hệt ở 384/384 tổ hợp state (mood_regulation còn 53 món, stress_response 221); lần chạy chính
  thức chưa chọn 2 món này. Đã seed lại ở máy: PostgreSQL excluded = 3 món, truy xuất PostgreSQL = JSON
  trên 384 tổ hợp, không món bị loại nào lọt qua.
- Unit test kiểm cả 3 mã không vào danh sách món dùng được.
- Cập nhật BAO_CAO_DANH_GIA.md, BAO_CAO_KET_QUA_CUOI.docx, idea.docx, TONG_KET_CHUYEN_GIA.md, README, flowchart dữ liệu.

Co-Authored-By: Claude Opus 5.5 <noreply@anthropic.com>
</commit_message>
<xml_diff>
--- a/idea.docx
+++ b/idea.docx
@@ -2350,44 +2350,32 @@
         </w:numPr>
       </w:pPr>
       <w:r>
-        <w:t xml:space="preserve">Dòng context: </w:t>
+        <w:t>Dòng context: NUT_xxx – &lt;món&gt; | &lt;hoạt chất chính&gt; | &lt;ACTION&gt; | &lt;cơ chế&gt;; mã NUT_xxx là thứ tự 1-based trong file 400 thực phẩm. NUT_060 (nhút) bị loại khỏi gợi ý vì ontology_effect chưa xác minh; NUT_043 (tiết lợn sống) và NUT_113 (lá sắn tươi) bị loại theo góp ý chuyên gia (28/10).</w:t>
       </w:r>
       <w:r>
         <w:rPr>
           <w:rStyle w:val="CodeChar"/>
         </w:rPr>
-        <w:t xml:space="preserve">NUT_xxx – &lt;món&gt; | &lt;hoạt chất chính&gt; | &lt;ACTION&gt; | &lt;cơ chế&gt;</w:t>
-      </w:r>
-      <w:r>
-        <w:t xml:space="preserve">; mã </w:t>
-      </w:r>
+      </w:r>
+      <w:r/>
       <w:r>
         <w:rPr>
           <w:rStyle w:val="CodeChar"/>
         </w:rPr>
-        <w:t xml:space="preserve">NUT_xxx</w:t>
-      </w:r>
-      <w:r>
-        <w:t xml:space="preserve"> là thứ tự 1-based trong file 400 thực phẩm. </w:t>
-      </w:r>
+      </w:r>
+      <w:r/>
       <w:r>
         <w:rPr>
           <w:rStyle w:val="CodeChar"/>
         </w:rPr>
-        <w:t xml:space="preserve">NUT_060</w:t>
-      </w:r>
-      <w:r>
-        <w:t xml:space="preserve"> (nhút) bị loại khỏi gợi ý vì </w:t>
-      </w:r>
+      </w:r>
+      <w:r/>
       <w:r>
         <w:rPr>
           <w:rStyle w:val="CodeChar"/>
         </w:rPr>
-        <w:t xml:space="preserve">ontology_effect</w:t>
-      </w:r>
-      <w:r>
-        <w:t xml:space="preserve"> chưa xác minh.</w:t>
-      </w:r>
+      </w:r>
+      <w:r/>
     </w:p>
     <w:p>
       <w:pPr>
@@ -7446,7 +7434,7 @@
         </w:numPr>
       </w:pPr>
       <w:r>
-        <w:t xml:space="preserve">Kho 400 thực phẩm còn món chuyên gia cảnh báo không an toàn (NUT_043 Tiết lợn sống) và món cần nấu kỹ (NUT_113 Lá sắn tươi), chưa loại khỏi gợi ý.</w:t>
+        <w:t>Kho 400 thực phẩm có món chuyên gia cảnh báo không an toàn (NUT_043 Tiết lợn sống) và món cần nấu kỹ (NUT_113 Lá sắn tươi); cả hai đã được loại khỏi gợi ý bằng excluded_foods ngày 28/10, sau lần đánh giá chính thức, không làm đổi số liệu đã báo cáo. Một số món khác chuyên gia lưu ý (cà muối rất mặn, trà Ô long có caffeine) vẫn được gợi ý.</w:t>
       </w:r>
     </w:p>
     <w:p>
@@ -7740,7 +7728,7 @@
         </w:numPr>
       </w:pPr>
       <w:r>
-        <w:t xml:space="preserve">☐ Quyết định loại NUT_043 (Tiết lợn sống), NUT_113 (Lá sắn tươi) khỏi gợi ý (excluded_foods)</w:t>
+        <w:t>☑ Loại NUT_043 (Tiết lợn sống), NUT_113 (Lá sắn tươi) khỏi gợi ý (excluded_foods, 28/10); đã seed lại và kiểm truy xuất PostgreSQL = JSON trên 384 tổ hợp state</w:t>
       </w:r>
     </w:p>
     <w:p>

</xml_diff>